<commit_message>
docs(veternity): cite real sources, drop em dashes, add references appendix
The proposal previously carried `[verifikasi: ...]` placeholders where the
statistics should have been. Those are now replaced with sourced figures:
Kemenkop UKM 2021 for the 64.2 million MSME baseline, SIDT-UMKM 2025 for the
99.70% micro share, SNLIK 2025 (OJK/BPS) for the inclusion-vs-literacy gap,
Podes 2024 for village signal coverage, plus IFC 2025 and three Indonesian
field studies for the credit-access and bookkeeping claims. A references
appendix now backs them, taking the document to 16 pages (13 content pages
still exactly at the committee limit, 1 cover, 2 appendix).

Also removes every em dash from the manuscript in favour of commas, colons,
semicolons and parentheses, and fixes the page-break helper to set
`page_break_before` on the target paragraph instead of emitting an empty
paragraph that could strand itself on its own page.

Word lock files (`~$*`) are now gitignored.
</commit_message>
<xml_diff>
--- a/docs/veternity/VB2026_WebDev_IDUBmandus.docx
+++ b/docs/veternity/VB2026_WebDev_IDUBmandus.docx
@@ -50,7 +50,7 @@
           <w:i w:val="0"/>
           <w:sz w:val="24"/>
         </w:rPr>
-        <w:t>Web Development Competition — Veternity Beraksi 2026</w:t>
+        <w:t>Web Development Competition, Veternity Beraksi 2026</w:t>
       </w:r>
     </w:p>
     <w:p>
@@ -209,7 +209,7 @@
                 <w:i w:val="0"/>
                 <w:sz w:val="22"/>
               </w:rPr>
-              <w:t>Muhammad Choirudin Ammar — 25/556251/TK/62735</w:t>
+              <w:t>Muhammad Choirudin Ammar (25/556251/TK/62735)</w:t>
             </w:r>
           </w:p>
         </w:tc>
@@ -253,7 +253,7 @@
                 <w:i w:val="0"/>
                 <w:sz w:val="22"/>
               </w:rPr>
-              <w:t>Muhammad Raihan Surya — 25/560713/TK/63338</w:t>
+              <w:t>Muhammad Raihan Surya (25/560713/TK/63338)</w:t>
             </w:r>
           </w:p>
         </w:tc>
@@ -297,7 +297,7 @@
                 <w:i w:val="0"/>
                 <w:sz w:val="22"/>
               </w:rPr>
-              <w:t>Ahmad Rafi Firdaus — 25/560526/TK/63314</w:t>
+              <w:t>Ahmad Rafi Firdaus (25/560526/TK/63314)</w:t>
             </w:r>
           </w:p>
         </w:tc>
@@ -495,12 +495,8 @@
       </w:r>
     </w:p>
     <w:p>
-      <w:r>
-        <w:br w:type="page"/>
-      </w:r>
-    </w:p>
-    <w:p>
       <w:pPr>
+        <w:pageBreakBefore/>
         <w:spacing w:line="360" w:lineRule="auto" w:after="100" w:before="200"/>
         <w:jc w:val="left"/>
       </w:pPr>
@@ -536,7 +532,7 @@
           <w:i w:val="0"/>
           <w:sz w:val="24"/>
         </w:rPr>
-        <w:t xml:space="preserve">Tracr — Buku Kas Digital yang Tetap Berjalan Saat Sinyal Mati: Platform Manajemen Keuangan Mikro Berbasis </w:t>
+        <w:t xml:space="preserve">Tracr, Buku Kas Digital yang Tetap Berjalan Saat Sinyal Mati: Platform Manajemen Keuangan Mikro Berbasis </w:t>
       </w:r>
       <w:r>
         <w:rPr>
@@ -596,7 +592,7 @@
           <w:i w:val="0"/>
           <w:sz w:val="24"/>
         </w:rPr>
-        <w:t>IDUB mandus — Universitas Gadjah Mada.</w:t>
+        <w:t>IDUB mandus, Universitas Gadjah Mada.</w:t>
       </w:r>
     </w:p>
     <w:p>
@@ -620,7 +616,7 @@
           <w:i w:val="0"/>
           <w:sz w:val="24"/>
         </w:rPr>
-        <w:t>Sub Tema 2 — Micro-Capital Crowdfunding &amp; Financial Management.</w:t>
+        <w:t>Sub Tema 2, Micro-Capital Crowdfunding &amp; Financial Management.</w:t>
       </w:r>
     </w:p>
     <w:p>
@@ -681,7 +677,7 @@
           <w:i w:val="0"/>
           <w:sz w:val="24"/>
         </w:rPr>
-        <w:t>UMKM merupakan tulang punggung perekonomian Indonesia: sekitar 64 juta unit, menyumbang sekitar 61% Produk Domestik Bruto dan menyerap sekitar 97% tenaga kerja [verifikasi: Kemenkop UKM]. Namun lebih dari 90% di antaranya berskala mikro — warung kelontong, pedagang kaki lima, penjual makanan rumahan, penjahit — dan menjalankan usaha tanpa pencatatan keuangan formal dalam bentuk apa pun [verifikasi: sumber proporsi usaha mikro]. Pada saat yang sama, sebagian besar penduduk dewasa masih tergolong unbanked atau underbanked [verifikasi: SNLIK OJK] sehingga hampir seluruh transaksinya berjalan tunai. Akibatnya, solusi keuangan digital yang mengandalkan sinkronisasi rekening bank — open banking, agregasi mutasi, kategorisasi otomatis dari pesan bank — tidak dapat menjangkau mereka sama sekali, karena data sumbernya memang tidak pernah ada.</w:t>
+        <w:t>UMKM adalah tulang punggung perekonomian Indonesia: sekitar 64,2 juta unit yang menyumbang 61,07% Produk Domestik Bruto dan menyerap 97% tenaga kerja nasional (Kementerian Koperasi dan UKM, 2021). Strukturnya timpang jauh ke bawah: basis data tunggal SIDT-UMKM mencatat 30.209.069 unit usaha terverifikasi per 31 Desember 2025 dan 99,70% di antaranya berskala mikro (Kementerian UMKM, 2025), yakni warung kelontong, pedagang kaki lima, penjual makanan rumahan, dan penjahit. Justru pada kelompok itulah pencatatan keuangan paling jarang ditemukan. Kajian lapangan di Pekanbaru mendapati pelaku UMKM umumnya hanya mencatat pemasukan dan pengeluaran seadanya, bahkan ada yang tidak mencatat sewa tempat sebagai beban sehingga usahanya tampak berlaba besar (Fatwitawati, 2018); dari 30 pelaku UMKM di Medan Timur, hanya sebagian kecil yang memahami akuntansi sederhana (Fadhia dan Ningsih, 2024).</w:t>
       </w:r>
     </w:p>
     <w:p>
@@ -696,7 +692,22 @@
           <w:i w:val="0"/>
           <w:sz w:val="24"/>
         </w:rPr>
-        <w:t>Kesenjangan itu diperparah sebaran kualitas jaringan yang tidak merata; sejumlah wilayah pedesaan masih berstatus blank spot [verifikasi: APJII]. Bagi pedagang pasar yang sedang melayani pembeli, aplikasi yang menampilkan layar kosong belasan detik karena menunggu peladen bukan sekadar tidak nyaman — aplikasi itu tidak dapat dipakai.</w:t>
+        <w:t>Akses keuangan formal pun belum merata. SNLIK 2025 mencatat indeks inklusi keuangan 80,51% berbanding indeks literasi keuangan 66,46%, sehingga sekitar satu dari lima penduduk dewasa masih di luar layanan keuangan formal dan selisih 14,05 poin itu memperlihatkan banyak orang memegang produk keuangan tanpa memahaminya; di perdesaan jaraknya melebar menjadi 75,70% berbanding 59,60% (OJK dan BPS, 2025). Transaksi kelompok ini karenanya berjalan tunai, dan solusi digital yang bertumpu pada sinkronisasi rekening bank (open banking, agregasi mutasi, kategorisasi otomatis dari pesan bank) tidak dapat menjangkau mereka karena data sumbernya memang tidak pernah ada.</w:t>
+      </w:r>
+    </w:p>
+    <w:p>
+      <w:pPr>
+        <w:spacing w:line="360" w:lineRule="auto" w:after="80" w:before="0"/>
+        <w:jc w:val="both"/>
+      </w:pPr>
+      <w:r>
+        <w:rPr>
+          <w:rFonts w:ascii="Times New Roman" w:hAnsi="Times New Roman" w:eastAsia="Times New Roman"/>
+          <w:b w:val="0"/>
+          <w:i w:val="0"/>
+          <w:sz w:val="24"/>
+        </w:rPr>
+        <w:t>Kesenjangan itu diperparah sebaran kualitas jaringan yang timpang. Pendataan Potensi Desa 2024, sensus atas 84.276 wilayah setingkat desa, mencatat 17,52% desa hanya menerima sinyal seluler lemah dan 3,70% tidak menerima sinyal sama sekali; 2,47% desa masih bergantung pada internet 2G/EDGE dan 1,26% tanpa sinyal internet (BPS, 2024). Bagi pedagang pasar yang sedang melayani pembeli, aplikasi yang menampilkan layar kosong belasan detik karena menunggu peladen bukan sekadar tidak nyaman; aplikasi itu tidak dapat dipakai.</w:t>
       </w:r>
     </w:p>
     <w:p>
@@ -1053,7 +1064,7 @@
                 <w:i w:val="0"/>
                 <w:sz w:val="19"/>
               </w:rPr>
-              <w:t>Pengajuan modal ditolak; usaha tidak naik kelas meskipun sehat secara arus kas</w:t>
+              <w:t>Pengajuan modal ditolak; usaha tidak naik kelas meskipun sehat secara arus kas (IFC, 2025)</w:t>
             </w:r>
           </w:p>
         </w:tc>
@@ -1071,7 +1082,7 @@
           <w:i w:val="0"/>
           <w:sz w:val="24"/>
         </w:rPr>
-        <w:t>Hambatan keempat adalah simpul persoalan yang sesungguhnya, dan menjadi alasan karya ini relevan dengan equitable economic access — bukan sekadar financial management. Pelaku usaha mikro dapat memiliki arus kas sehat bertahun-tahun namun tetap ditolak saat mengajukan modal, semata-mata karena tidak memiliki dokumen yang membuktikannya. Bagi lembaga keuangan, usaha tanpa catatan adalah usaha yang tidak terlihat.</w:t>
+        <w:t>Hambatan keempat adalah simpul persoalan yang sesungguhnya, dan menjadi alasan karya ini relevan dengan equitable economic access, bukan sekadar financial management. Pelaku usaha mikro dapat memiliki arus kas sehat bertahun-tahun namun tetap ditolak saat mengajukan modal, semata-mata karena tidak memiliki dokumen yang membuktikannya. IFC menyebut akarnya sebagai asimetri informasi: pemberi pinjaman tidak memiliki cukup keterangan untuk menilai kelayakan kredit UMKM, sehingga risikonya dipersepsikan lebih tinggi (IFC, 2025). Bagi lembaga keuangan, usaha tanpa catatan adalah usaha yang tidak terlihat.</w:t>
       </w:r>
     </w:p>
     <w:p>
@@ -1101,7 +1112,7 @@
           <w:i w:val="0"/>
           <w:sz w:val="24"/>
         </w:rPr>
-        <w:t>Aplikasi pembukuan yang beredar mengandaikan tiga hal yang justru tidak dimiliki kelompok sasaran: koneksi stabil, keakraban dengan istilah akuntansi, dan kesediaan memasang aplikasi berukuran besar. Sebagian juga mengunci laporan laba rugi dan ekspor data di balik langganan berbayar, tepat ketika data itu mulai berguna. Yang paling menentukan, banyak aplikasi memperlakukan dukungan luring hanya sebagai penyimpanan sementara untuk membaca data; ketika pengguna mencoba menulis, operasi tersebut gagal atau menggantung. Padahal justru menulis itulah inti sebuah buku kas.</w:t>
+        <w:t>Aplikasi pembukuan yang beredar mengandaikan tiga hal yang justru tidak dimiliki kelompok sasaran: koneksi stabil, keakraban dengan istilah akuntansi, dan kesediaan memasang aplikasi berukuran besar. Sebagian juga mengunci laporan laba rugi dan ekspor data di balik langganan berbayar, tepat ketika data itu mulai berguna. Yang paling menentukan, banyak aplikasi memperlakukan dukungan luring hanya sebagai penyimpanan sementara untuk membaca data; ketika pengguna mencoba menulis, operasi tersebut gagal atau menggantung. Padahal justru menulis itulah inti sebuah buku kas. Evaluasi aplikasi akuntansi UMKM berbasis awan menyimpulkan kunci penerimaan pengguna justru terletak pada logika debit-kredit yang disembunyikan di balik antarmuka (Mayasari dkk., 2025).</w:t>
       </w:r>
     </w:p>
     <w:p>
@@ -1225,7 +1236,7 @@
           <w:i/>
           <w:sz w:val="24"/>
         </w:rPr>
-        <w:t>Pilar 1 — Offline-First yang Sesungguhnya</w:t>
+        <w:t>Pilar 1: Offline-First yang Sesungguhnya</w:t>
       </w:r>
     </w:p>
     <w:p>
@@ -1318,7 +1329,7 @@
           <w:i/>
           <w:sz w:val="24"/>
         </w:rPr>
-        <w:t>Pilar 2 — Bahasa Manusia, Bukan Bahasa Akuntansi</w:t>
+        <w:t>Pilar 2: Bahasa Manusia, Bukan Bahasa Akuntansi</w:t>
       </w:r>
     </w:p>
     <w:p>
@@ -1333,7 +1344,7 @@
           <w:i w:val="0"/>
           <w:sz w:val="24"/>
         </w:rPr>
-        <w:t>Antarmuka berbahasa Indonesia secara bawaan dan sengaja menghindari istilah akuntansi. Pengguna tidak pernah bertemu kata “liabilitas”; yang muncul adalah jenis akun “Kartu Kredit” atau “Pinjaman” yang menjelaskan dirinya sebagai uang yang harus dibayar. Pada modul utang-piutang pilihannya “Pelanggan ngutang” dan “Saya ngutang”; pada modul usaha kolomnya bernama “Modal” dan hasilnya “Untung”. Aksesibilitas juga ditangani secara teknis: pengaturan ukuran teks, mode gelap, kontras yang dijaga, navigasi bawah pada tampilan telepon, serta status kosong yang selalu menawarkan satu tindakan berikutnya.</w:t>
+        <w:t>Antarmuka berbahasa Indonesia secara bawaan dan sengaja menghindari istilah akuntansi. Pengguna tidak pernah bertemu kata “liabilitas”; yang muncul adalah jenis akun “Kartu Kredit” atau “Pinjaman” yang menjelaskan dirinya sebagai uang yang harus dibayar. Pada modul utang-piutang pilihannya “Pelanggan ngutang” dan “Saya ngutang”; pada modul usaha kolomnya bernama “Modal” dan hasilnya “Untung”. Rinciannya dibahas pada Bagian 8.</w:t>
       </w:r>
     </w:p>
     <w:p>
@@ -1348,7 +1359,7 @@
           <w:i/>
           <w:sz w:val="24"/>
         </w:rPr>
-        <w:t>Pilar 3 — Dua Buku dalam Satu Aplikasi</w:t>
+        <w:t>Pilar 3: Dua Buku dalam Satu Aplikasi</w:t>
       </w:r>
     </w:p>
     <w:p>
@@ -1363,7 +1374,7 @@
           <w:i w:val="0"/>
           <w:sz w:val="24"/>
         </w:rPr>
-        <w:t>Nasihat pertama setiap pendamping UMKM adalah memisahkan uang pribadi dari uang usaha. Tracr menjadikannya satu ketukan: setiap catatan dipartisi berdasarkan book_id, dan setiap buku berjenis personal atau business. Saat pengguna berpindah ke buku usaha, aplikasi membuka tiga alat yang tidak relevan bagi pengguna pribadi — Produk &amp; Kasir Sederhana, Utang-Piutang, dan Laba Rugi.</w:t>
+        <w:t>Nasihat pertama setiap pendamping UMKM adalah memisahkan uang pribadi dari uang usaha. Tracr menjadikannya satu ketukan: setiap catatan dipartisi berdasarkan book_id, dan setiap buku berjenis personal atau business. Saat pengguna berpindah ke buku usaha, aplikasi membuka tiga alat yang tidak relevan bagi pengguna pribadi: Produk &amp; Kasir Sederhana, Utang-Piutang, dan Laba Rugi.</w:t>
       </w:r>
     </w:p>
     <w:p>
@@ -1393,7 +1404,7 @@
           <w:i w:val="0"/>
           <w:sz w:val="24"/>
         </w:rPr>
-        <w:t>Ketiga pilar bermuara pada satu keluaran yang menjawab hambatan keempat pada Bagian 2.2. Setelah beberapa bulan mencatat, pengguna dapat menghasilkan Laporan Laba Rugi dan riwayat transaksi lengkap dalam bentuk PDF maupun CSV — dokumen yang selama ini tidak dimiliki pelaku usaha mikro saat berhadapan dengan bank, koperasi, atau program pendanaan. Tracr karena itu bukan sekadar alat catat-mencatat, melainkan mesin pembentuk rekam jejak keuangan yang mengubah usaha yang tidak terlihat menjadi usaha yang dapat dinilai.</w:t>
+        <w:t>Ketiga pilar bermuara pada satu keluaran yang menjawab hambatan keempat pada Bagian 2.2. Setelah beberapa bulan mencatat, pengguna dapat menghasilkan Laporan Laba Rugi dan riwayat transaksi lengkap dalam bentuk PDF maupun CSV, dokumen yang selama ini tidak dimiliki pelaku usaha mikro saat berhadapan dengan bank, koperasi, atau program pendanaan. Tracr karena itu bukan sekadar alat catat-mencatat, melainkan pembentuk rekam jejak yang mengubah usaha tak terlihat menjadi usaha yang dapat dinilai.</w:t>
       </w:r>
     </w:p>
     <w:p>
@@ -1424,7 +1435,7 @@
           <w:i w:val="0"/>
           <w:sz w:val="24"/>
         </w:rPr>
-        <w:t>1.  Membangun platform manajemen keuangan mikro yang berfungsi penuh — termasuk operasi penulisan — tanpa koneksi internet, dan menyinkronkan data secara berurutan serta dapat diaudit ketika koneksi pulih.</w:t>
+        <w:t>1.  Membangun platform manajemen keuangan mikro yang berfungsi penuh, termasuk operasi penulisan, tanpa koneksi internet, dan menyinkronkan data secara berurutan serta dapat diaudit ketika koneksi pulih.</w:t>
       </w:r>
     </w:p>
     <w:p>
@@ -2172,7 +2183,7 @@
           <w:i w:val="0"/>
           <w:sz w:val="24"/>
         </w:rPr>
-        <w:t>2.  Pengguna memiliki akses internet sesekali — tidak harus terus-menerus — untuk masuk pertama kali dan menyinkronkan data.</w:t>
+        <w:t>2.  Pengguna memiliki akses internet sesekali, tidak harus terus-menerus, untuk masuk pertama kali dan menyinkronkan data.</w:t>
       </w:r>
     </w:p>
     <w:p>
@@ -2739,7 +2750,7 @@
           <w:i w:val="0"/>
           <w:sz w:val="24"/>
         </w:rPr>
-        <w:t>Seluruh nilai uang disimpan sebagai bilangan bulat satuan terkecil (bigint) — rupiah tanpa desimal, sen untuk mata uang dua desimal, satoshi untuk aset kripto. Tidak ada nilai uang yang pernah disimpan sebagai bilangan pecahan; konversi hanya terjadi di tepi sistem melalui src/lib/money.ts, sehingga galat pembulatan pecahan biner yang lazim pada aplikasi keuangan berbasis JavaScript tidak dapat muncul. Saldo akun pun tidak dihitung di sisi klien: view SQL account_balances menjumlahkan saldo awal ditambah seluruh mutasi bertanda, termasuk transfer yang mendebit akun asal dan mengkredit akun tujuan, dan klien hanya membaca hasilnya.</w:t>
+        <w:t>Seluruh nilai uang disimpan sebagai bilangan bulat satuan terkecil (bigint), yakni rupiah tanpa desimal, sen untuk mata uang dua desimal, satoshi untuk aset kripto. Konversi hanya terjadi di tepi sistem melalui src/lib/money.ts, sehingga galat pembulatan pecahan biner yang lazim pada aplikasi keuangan berbasis JavaScript tidak dapat muncul. Saldo akun pun tidak dihitung di sisi klien: view SQL account_balances menjumlahkan saldo awal ditambah seluruh mutasi bertanda, termasuk transfer yang mendebit akun asal dan mengkredit akun tujuan.</w:t>
       </w:r>
     </w:p>
     <w:p>
@@ -3049,7 +3060,7 @@
                 <w:i w:val="0"/>
                 <w:sz w:val="19"/>
               </w:rPr>
-              <w:t>Mode luring penuh untuk lebih dari 40 jenis operasi tulis; pemasangan PWA tanpa toko aplikasi; dwibahasa Indonesia–Inggris; pengaturan ukuran teks dan mode gelap; bot Telegram; notifikasi Web Push</w:t>
+              <w:t>Mode luring penuh untuk lebih dari 40 jenis operasi tulis; pemasangan PWA tanpa toko aplikasi; dwibahasa Indonesia-Inggris; pengaturan ukuran teks dan mode gelap; bot Telegram; notifikasi Web Push</w:t>
             </w:r>
           </w:p>
         </w:tc>
@@ -3106,7 +3117,7 @@
           <w:i w:val="0"/>
           <w:sz w:val="24"/>
         </w:rPr>
-        <w:t>Sebagian besar aplikasi menyebut dirinya mendukung mode luring padahal hanya menyinggahkan data untuk dibaca. Tracr mengantre operasi penulisan, memutarnya ulang berurutan, memindahkan kegagalan ke antrian yang terlihat pengguna, dan — bagian yang paling jarang ditemui — menukar identitas sementara dengan UUID asli pada seluruh mutasi yang masih mengantre, sehingga entitas yang dibuat dan langsung dipakai saat luring tidak menghasilkan rujukan menggantung.</w:t>
+        <w:t>Yang paling jarang ditemui bukan antriannya, melainkan penukaran identitas sementara dengan UUID asli pada seluruh mutasi yang masih mengantre, sehingga entitas yang dibuat dan langsung dipakai saat luring tidak menghasilkan rujukan menggantung.</w:t>
       </w:r>
     </w:p>
     <w:p>
@@ -3130,7 +3141,7 @@
           <w:i w:val="0"/>
           <w:sz w:val="24"/>
         </w:rPr>
-        <w:t>Tabel transaction_items menyimpan unit_price dan unit_cost sebagai salinan saat penjualan terjadi, bukan rujukan ke harga produk saat ini. Ketika pedagang menaikkan harga bulan depan, laba bulan lalu tidak ikut berubah. Implementasi naif yang menghitung laba dengan menggabungkan penjualan ke harga produk terkini menghasilkan laporan historis yang keliru — dan kekeliruan itu tidak terlihat sampai harga berubah.</w:t>
+        <w:t>Tabel transaction_items menyimpan unit_price dan unit_cost sebagai salinan saat penjualan terjadi, bukan rujukan ke harga produk saat ini. Ketika pedagang menaikkan harga bulan depan, laba bulan lalu tidak ikut berubah. Implementasi naif yang menggabungkan penjualan ke harga produk terkini menghasilkan laporan historis yang keliru, dan kekeliruan itu tidak terlihat sampai harga berubah.</w:t>
       </w:r>
     </w:p>
     <w:p>
@@ -3154,7 +3165,7 @@
           <w:i w:val="0"/>
           <w:sz w:val="24"/>
         </w:rPr>
-        <w:t>Dari kolom basis data, tipe TypeScript, keadaan formulir, hingga hasil perhitungan laba, tidak ada bilangan pecahan. Ketepatan terjaga secara struktural, bukan karena pembulatan di akhir.</w:t>
+        <w:t>Dari kolom basis data hingga hasil perhitungan laba tidak ada bilangan pecahan; ketepatan terjaga secara struktural, bukan karena pembulatan di akhir.</w:t>
       </w:r>
     </w:p>
     <w:p>
@@ -3202,7 +3213,7 @@
           <w:i w:val="0"/>
           <w:sz w:val="24"/>
         </w:rPr>
-        <w:t>Setiap transaksi menyimpan base_amount dan fx_rate saat pembuatan, sehingga riwayat keuangan tidak berubah ketika kurs bergerak — perilaku yang benar secara akuntansi dan jarang diterapkan aplikasi sejenis.</w:t>
+        <w:t>Setiap transaksi menyimpan base_amount dan fx_rate saat pembuatan, sehingga riwayat keuangan tidak berubah ketika kurs bergerak, perilaku yang benar secara akuntansi dan jarang diterapkan aplikasi sejenis.</w:t>
       </w:r>
     </w:p>
     <w:p>
@@ -3233,7 +3244,7 @@
           <w:i w:val="0"/>
           <w:sz w:val="24"/>
         </w:rPr>
-        <w:t>Row Level Security pada seluruh tabel dengan kebijakan auth.uid() = user_id; tabel penghubung menyalin user_id agar kebijakan tetap sederhana. Tidak ada jalur baca atau tulis yang dapat menembus batas antarpengguna, bahkan bila kunci publik klien bocor — sebab kunci tersebut memang dirancang untuk publik.</w:t>
+        <w:t>Row Level Security pada seluruh tabel dengan kebijakan auth.uid() = user_id; tabel penghubung menyalin user_id agar kebijakan tetap sederhana. Tidak ada jalur baca atau tulis yang dapat menembus batas antarpengguna, bahkan bila kunci publik klien bocor, sebab kunci tersebut memang dirancang untuk publik.</w:t>
       </w:r>
     </w:p>
     <w:p>
@@ -3249,7 +3260,7 @@
           <w:i w:val="0"/>
           <w:sz w:val="24"/>
         </w:rPr>
-        <w:t>Rahasia tidak pernah berada di peramban: seluruh kunci pihak ketiga berada pada Edge Functions, dan rahasia pemanggilan pg_cron disimpan pada tabel app_secrets yang terkunci RLS. Lampiran pun privat — bucket Storage tidak dapat diakses publik dan hanya terbuka melalui URL bertanda tangan berumur pendek.</w:t>
+        <w:t>Rahasia tidak pernah berada di peramban: seluruh kunci pihak ketiga berada pada Edge Functions, dan rahasia pemanggilan pg_cron disimpan pada tabel app_secrets yang terkunci RLS. Lampiran pun privat: bucket Storage tidak dapat diakses publik dan hanya terbuka melalui URL bertanda tangan berumur pendek.</w:t>
       </w:r>
     </w:p>
     <w:p>
@@ -3311,7 +3322,7 @@
           <w:i w:val="0"/>
           <w:sz w:val="24"/>
         </w:rPr>
-        <w:t>Seluruh fitur inti — pencatatan, laporan, Buku Usaha, mode luring, dan ekspor data — direncanakan tetap gratis tanpa batas waktu; frontend berupa berkas statis sedangkan basis data dan autentikasi berjalan pada paket gratis. Untuk pembiayaan jangka panjang, Tracr menyiapkan lapisan analisis berbasis kecerdasan buatan sebagai layanan tambahan opsional berbasis kredit yang berada sepenuhnya di luar jalur pencatatan: pengguna yang tidak pernah membelinya tetap memperoleh aplikasi yang utuh. Skemanya bersifat subsidi silang — pengguna yang mampu membiayai kelangsungan layanan bagi yang tidak mampu. Pada versi yang dinilai dalam kompetisi ini, jalur pembayaran dinonaktifkan.</w:t>
+        <w:t>Seluruh fitur inti (pencatatan, laporan, Buku Usaha, mode luring, dan ekspor data) direncanakan tetap gratis tanpa batas waktu; frontend berupa berkas statis sedangkan basis data dan autentikasi berjalan pada paket gratis. Untuk pembiayaan jangka panjang, Tracr menyiapkan lapisan analisis berbasis kecerdasan buatan sebagai layanan tambahan opsional berbasis kredit di luar jalur pencatatan, sehingga pengguna yang tidak pernah membelinya tetap memperoleh aplikasi yang utuh dan pengguna yang mampu menyubsidi yang tidak mampu. Pada versi yang dinilai dalam kompetisi ini, jalur pembayaran dinonaktifkan.</w:t>
       </w:r>
     </w:p>
     <w:p>
@@ -3357,7 +3368,7 @@
           <w:i w:val="0"/>
           <w:sz w:val="24"/>
         </w:rPr>
-        <w:t>Tracr menggunakan arsitektur serverless tiga lapis tanpa peladen aplikasi yang dikelola sendiri. Frontend adalah berkas statis; seluruh logika istimewa berada pada Edge Functions; basis data menegakkan keamanannya sendiri melalui Row Level Security. Alur pencatatan luring dan sinkronisasi ulang — jalur paling menentukan bagi kelompok sasaran — digambarkan tersendiri pada Gambar 4 di Lampiran.</w:t>
+        <w:t>Tracr menggunakan arsitektur serverless tiga lapis tanpa peladen aplikasi yang dikelola sendiri: frontend berupa berkas statis, seluruh logika istimewa pada Edge Functions, dan basis data yang menegakkan keamanannya sendiri melalui Row Level Security. Alur pencatatan luring dan sinkronisasi ulang digambarkan tersendiri pada Gambar 4 di Lampiran.</w:t>
       </w:r>
     </w:p>
     <w:p>
@@ -3597,7 +3608,7 @@
           <w:i w:val="0"/>
           <w:sz w:val="24"/>
         </w:rPr>
-        <w:t xml:space="preserve">Skenario A — Pedagang di pasar tanpa sinyal. </w:t>
+        <w:t xml:space="preserve">Skenario A. Pedagang di pasar tanpa sinyal. </w:t>
       </w:r>
       <w:r>
         <w:rPr>
@@ -3606,7 +3617,7 @@
           <w:i w:val="0"/>
           <w:sz w:val="24"/>
         </w:rPr>
-        <w:t>Bu Sari berjualan nasi di pasar dengan sinyal hilang timbul. Ia membuka Tracr dari layar utama telepon genggamnya; aplikasi terbuka seketika karena cangkangnya sudah tersimpan di perangkat. Ia mengetuk tiga produk pada layar kasir lalu menekan “Catat Jualan”; catatan langsung muncul dan spanduk memberitahu satu catatan menunggu sinkronisasi. Sore hari, saat terhubung Wi-Fi rumah, seluruh antrian terkirim berurutan tanpa perlu ia lakukan apa pun.</w:t>
+        <w:t>Bu Sari berjualan nasi di pasar dengan sinyal hilang timbul. Ia membuka Tracr dari layar utama telepon genggamnya; aplikasi terbuka seketika karena cangkangnya sudah tersimpan di perangkat. Ia mengetuk tiga produk pada layar kasir lalu menekan “Catat Jualan”; catatan langsung muncul dan spanduk memberitahu satu catatan menunggu sinkronisasi. Sore hari, saat terhubung Wi-Fi rumah, seluruh antrian terkirim berurutan.</w:t>
       </w:r>
     </w:p>
     <w:p>
@@ -3621,7 +3632,7 @@
           <w:i w:val="0"/>
           <w:sz w:val="24"/>
         </w:rPr>
-        <w:t xml:space="preserve">Skenario B — Menagih utang pelanggan. </w:t>
+        <w:t xml:space="preserve">Skenario B. Menagih utang pelanggan. </w:t>
       </w:r>
       <w:r>
         <w:rPr>
@@ -3630,7 +3641,7 @@
           <w:i w:val="0"/>
           <w:sz w:val="24"/>
         </w:rPr>
-        <w:t>Pak Budi membuka halaman Utang-Piutang yang tersusun per orang. Kartu “Wati” menunjukkan total Rp185.000 dengan keterangan “Lewat 4 hari”; ia membentangkannya, lalu mengetuk tombol pengingat — aplikasi membuka WhatsApp dengan pesan yang sudah tersusun.</w:t>
+        <w:t>Pak Budi membuka halaman Utang-Piutang yang tersusun per orang. Kartu “Wati” menunjukkan total Rp185.000 dengan keterangan “Lewat 4 hari”; ia membentangkannya, lalu mengetuk tombol pengingat, dan aplikasi membuka WhatsApp dengan pesan yang sudah tersusun.</w:t>
       </w:r>
     </w:p>
     <w:p>
@@ -3645,7 +3656,7 @@
           <w:i w:val="0"/>
           <w:sz w:val="24"/>
         </w:rPr>
-        <w:t xml:space="preserve">Skenario C — Mengajukan modal. </w:t>
+        <w:t xml:space="preserve">Skenario C. Mengajukan modal. </w:t>
       </w:r>
       <w:r>
         <w:rPr>
@@ -3654,7 +3665,7 @@
           <w:i w:val="0"/>
           <w:sz w:val="24"/>
         </w:rPr>
-        <w:t>Setelah enam bulan mencatat, Bu Sari membuka Laba Rugi, memilih periode satu tahun, lalu menekan “Cetak / PDF”. Dokumen hasilnya ia lampirkan dalam pengajuan kredit usaha rakyat — bukti tertulis yang sebelumnya tidak pernah ia miliki.</w:t>
+        <w:t>Setelah enam bulan mencatat, Bu Sari membuka Laba Rugi, memilih periode satu tahun, lalu menekan “Cetak / PDF”. Dokumen hasilnya ia lampirkan dalam pengajuan kredit usaha rakyat, bukti tertulis yang sebelumnya tidak pernah ia miliki.</w:t>
       </w:r>
     </w:p>
     <w:p>
@@ -3749,7 +3760,7 @@
           <w:i w:val="0"/>
           <w:sz w:val="24"/>
         </w:rPr>
-        <w:t>4.  Kata sehari-hari: “Pelanggan ngutang”, “Modal”, “Untung” — bukan “piutang”, “harga pokok penjualan”, “laba bersih”. Navigasi utama pun berada di bawah pada tampilan telepon genggam agar terjangkau ibu jari.</w:t>
+        <w:t>4.  Kata sehari-hari: “Pelanggan ngutang”, “Modal”, “Untung”, bukan “piutang”, “harga pokok penjualan”, “laba bersih”; navigasi utama di bawah agar terjangkau ibu jari.</w:t>
       </w:r>
     </w:p>
     <w:p>
@@ -3765,21 +3776,6 @@
           <w:sz w:val="24"/>
         </w:rPr>
         <w:t>8.2 Tangkapan Layar</w:t>
-      </w:r>
-    </w:p>
-    <w:p>
-      <w:pPr>
-        <w:spacing w:line="360" w:lineRule="auto" w:after="80" w:before="0"/>
-        <w:jc w:val="center"/>
-      </w:pPr>
-      <w:r>
-        <w:rPr>
-          <w:rFonts w:ascii="Times New Roman" w:hAnsi="Times New Roman" w:eastAsia="Times New Roman"/>
-          <w:b w:val="0"/>
-          <w:i/>
-          <w:sz w:val="22"/>
-        </w:rPr>
-        <w:t>[PLACEHOLDER — tangkapan layar antarmuka diisi sebelum berkas dikirimkan]</w:t>
       </w:r>
     </w:p>
     <w:tbl>
@@ -4280,7 +4276,7 @@
                 <w:i w:val="0"/>
                 <w:sz w:val="19"/>
               </w:rPr>
-              <w:t>Daftar per hari, panel penyaring lengkap, chip penyaring aktif, mode pilih-banyak dengan tindakan massal; formulir modal memuat tiga tab jenis transaksi, kolom jumlah berkalkulator, pemilih kategori bertingkat, chip label, mode terbagi, dan lampiran struk</w:t>
+              <w:t>Daftar per hari, panel penyaring lengkap, mode pilih-banyak; formulir modal memuat tiga tab jenis transaksi, kolom berkalkulator, kategori bertingkat, label, dan lampiran struk</w:t>
             </w:r>
           </w:p>
         </w:tc>
@@ -4475,7 +4471,7 @@
                 <w:i w:val="0"/>
                 <w:sz w:val="19"/>
               </w:rPr>
-              <w:t>Kartu Penjualan, Modal, Laba Kotor, Biaya, Laba Bersih; pemilih rentang tanggal yang menggerakkan seluruh grafik; donat kategori; tren kekayaan bersih; peta panas harian; cetak/PDF</w:t>
+              <w:t>Kartu Penjualan, Modal, Laba Kotor, Biaya, Laba Bersih; pemilih rentang tanggal, donat kategori, peta panas harian, cetak/PDF</w:t>
             </w:r>
           </w:p>
         </w:tc>
@@ -4574,7 +4570,7 @@
           <w:i w:val="0"/>
           <w:sz w:val="24"/>
         </w:rPr>
-        <w:t>Bahasa Indonesia sebagai bahasa bawaan; pengaturan ukuran teks di dalam aplikasi, terpisah dari pengaturan sistem; mode terang dan gelap dengan rasio kontras yang dijaga.</w:t>
+        <w:t>Bahasa Indonesia sebagai bahasa bawaan; pengaturan ukuran teks di dalam aplikasi, terpisah dari pengaturan sistem; mode terang dan gelap dengan rasio kontras yang dijaga; sasaran ketukan yang lapang dan kerangka pemuatan berukuran tetap sehingga tata letak tidak melompat saat data tiba.</w:t>
       </w:r>
     </w:p>
     <w:p>
@@ -4590,16 +4586,12 @@
           <w:i w:val="0"/>
           <w:sz w:val="24"/>
         </w:rPr>
-        <w:t>Sasaran ketukan yang lapang dan kerangka pemuatan berukuran tetap sehingga tata letak tidak melompat saat data tiba. Di atas semua itu, aplikasi tetap dapat digunakan penuh tanpa jaringan — aksesibilitas yang paling menentukan bagi pengguna di daerah bersinyal terbatas.</w:t>
-      </w:r>
-    </w:p>
-    <w:p>
-      <w:r>
-        <w:br w:type="page"/>
+        <w:t>Yang paling menentukan: aplikasi tetap dapat dipakai penuh tanpa jaringan.</w:t>
       </w:r>
     </w:p>
     <w:p>
       <w:pPr>
+        <w:pageBreakBefore/>
         <w:spacing w:line="360" w:lineRule="auto" w:after="100" w:before="200"/>
         <w:jc w:val="left"/>
       </w:pPr>
@@ -4821,17 +4813,145 @@
     </w:p>
     <w:p>
       <w:pPr>
-        <w:spacing w:line="360" w:lineRule="auto" w:after="80" w:before="120"/>
+        <w:spacing w:line="360" w:lineRule="auto" w:after="80" w:before="140"/>
+        <w:jc w:val="left"/>
+      </w:pPr>
+      <w:r>
+        <w:rPr>
+          <w:rFonts w:ascii="Times New Roman" w:hAnsi="Times New Roman" w:eastAsia="Times New Roman"/>
+          <w:b/>
+          <w:i w:val="0"/>
+          <w:sz w:val="24"/>
+        </w:rPr>
+        <w:t>Daftar Pustaka</w:t>
+      </w:r>
+    </w:p>
+    <w:p>
+      <w:pPr>
+        <w:spacing w:line="240" w:lineRule="auto" w:after="80" w:before="0"/>
+        <w:ind w:left="567" w:hanging="567"/>
         <w:jc w:val="both"/>
       </w:pPr>
       <w:r>
         <w:rPr>
           <w:rFonts w:ascii="Times New Roman" w:hAnsi="Times New Roman" w:eastAsia="Times New Roman"/>
           <w:b w:val="0"/>
-          <w:i/>
-          <w:sz w:val="22"/>
+          <w:i w:val="0"/>
+          <w:sz w:val="20"/>
         </w:rPr>
-        <w:t>Catatan penyusunan: seluruh angka statistik yang ditandai [verifikasi] pada Bagian 2 wajib dicocokkan dengan sumber resmi dan dilengkapi sitasi sebelum berkas dikirimkan.</w:t>
+        <w:t>Badan Pusat Statistik. (2024). Statistik Potensi Desa Indonesia 2024 (Katalog 1105014, Nomor Publikasi 04300.24002). Jakarta: Badan Pusat Statistik. Diakses dari https://www.bps.go.id/id/publication/2024/12/10/2f5217e2d6a695a0830290a7/statistik-potensi-desa-indonesia-2024.html</w:t>
+      </w:r>
+    </w:p>
+    <w:p>
+      <w:pPr>
+        <w:spacing w:line="240" w:lineRule="auto" w:after="80" w:before="0"/>
+        <w:ind w:left="567" w:hanging="567"/>
+        <w:jc w:val="both"/>
+      </w:pPr>
+      <w:r>
+        <w:rPr>
+          <w:rFonts w:ascii="Times New Roman" w:hAnsi="Times New Roman" w:eastAsia="Times New Roman"/>
+          <w:b w:val="0"/>
+          <w:i w:val="0"/>
+          <w:sz w:val="20"/>
+        </w:rPr>
+        <w:t>Fadhia, N., dan Ningsih, D. A. (2024). Penggunaan Pencatatan Akuntansi pada Usaha Mikro Kecil dan Menengah. Liabilities: Jurnal Pendidikan Akuntansi, 7(1), 30-37. ISSN 2620-5866. Diakses dari https://jurnal.umsu.ac.id/index.php/LIAB/article/view/15883</w:t>
+      </w:r>
+    </w:p>
+    <w:p>
+      <w:pPr>
+        <w:spacing w:line="240" w:lineRule="auto" w:after="80" w:before="0"/>
+        <w:ind w:left="567" w:hanging="567"/>
+        <w:jc w:val="both"/>
+      </w:pPr>
+      <w:r>
+        <w:rPr>
+          <w:rFonts w:ascii="Times New Roman" w:hAnsi="Times New Roman" w:eastAsia="Times New Roman"/>
+          <w:b w:val="0"/>
+          <w:i w:val="0"/>
+          <w:sz w:val="20"/>
+        </w:rPr>
+        <w:t>Fatwitawati, R. (2018). Pengelolaan Keuangan bagi Usaha Mikro Kecil Menengah (UMKM) di Kelurahan Airputih, Kecamatan Tampan, Kota Pekanbaru. Sembadha: Seminar Hasil Pengabdian kepada Masyarakat. Jakarta: PKN STAN Press. Diakses dari https://jurnal.pknstan.ac.id/index.php/sembadha/article/view/376</w:t>
+      </w:r>
+    </w:p>
+    <w:p>
+      <w:pPr>
+        <w:spacing w:line="240" w:lineRule="auto" w:after="80" w:before="0"/>
+        <w:ind w:left="567" w:hanging="567"/>
+        <w:jc w:val="both"/>
+      </w:pPr>
+      <w:r>
+        <w:rPr>
+          <w:rFonts w:ascii="Times New Roman" w:hAnsi="Times New Roman" w:eastAsia="Times New Roman"/>
+          <w:b w:val="0"/>
+          <w:i w:val="0"/>
+          <w:sz w:val="20"/>
+        </w:rPr>
+        <w:t>International Finance Corporation. (2025). MSME Finance Gap: An Updated Estimation and Evolution of the Micro, Small and Medium Enterprises Gap in Emerging and Developing Markets. Washington, DC: World Bank Group. Diakses dari https://www.smefinanceforum.org/data-sites/msme-finance-gap</w:t>
+      </w:r>
+    </w:p>
+    <w:p>
+      <w:pPr>
+        <w:spacing w:line="240" w:lineRule="auto" w:after="80" w:before="0"/>
+        <w:ind w:left="567" w:hanging="567"/>
+        <w:jc w:val="both"/>
+      </w:pPr>
+      <w:r>
+        <w:rPr>
+          <w:rFonts w:ascii="Times New Roman" w:hAnsi="Times New Roman" w:eastAsia="Times New Roman"/>
+          <w:b w:val="0"/>
+          <w:i w:val="0"/>
+          <w:sz w:val="20"/>
+        </w:rPr>
+        <w:t>Kementerian Koperasi dan UKM. (2021). Data UMKM Semester I 2021, dikutip dalam Junaidi, M. (2024), UMKM Hebat, Perekonomian Nasional Meningkat. Direktorat Jenderal Perbendaharaan, Kementerian Keuangan Republik Indonesia. Diakses dari https://djpb.kemenkeu.go.id/kppn/curup/id/data-publikasi/artikel/2885-umkm-hebat,-perekonomian-nasional-meningkat.html</w:t>
+      </w:r>
+    </w:p>
+    <w:p>
+      <w:pPr>
+        <w:spacing w:line="240" w:lineRule="auto" w:after="80" w:before="0"/>
+        <w:ind w:left="567" w:hanging="567"/>
+        <w:jc w:val="both"/>
+      </w:pPr>
+      <w:r>
+        <w:rPr>
+          <w:rFonts w:ascii="Times New Roman" w:hAnsi="Times New Roman" w:eastAsia="Times New Roman"/>
+          <w:b w:val="0"/>
+          <w:i w:val="0"/>
+          <w:sz w:val="20"/>
+        </w:rPr>
+        <w:t>Kementerian UMKM Republik Indonesia. (2025). Sistem Informasi Data Tunggal UMKM (SIDT-UMKM), posisi 31 Desember 2025. Diakses melalui https://satudata.kemenkopukm.go.id dan https://ukmindonesia.id/baca-deskripsi-posts/data-umkm-jumlah-dan-pertumbuhan-usaha-mikro-kecil-dan-menengah-di-indonesia</w:t>
+      </w:r>
+    </w:p>
+    <w:p>
+      <w:pPr>
+        <w:spacing w:line="240" w:lineRule="auto" w:after="80" w:before="0"/>
+        <w:ind w:left="567" w:hanging="567"/>
+        <w:jc w:val="both"/>
+      </w:pPr>
+      <w:r>
+        <w:rPr>
+          <w:rFonts w:ascii="Times New Roman" w:hAnsi="Times New Roman" w:eastAsia="Times New Roman"/>
+          <w:b w:val="0"/>
+          <w:i w:val="0"/>
+          <w:sz w:val="20"/>
+        </w:rPr>
+        <w:t>Mayasari, M., Supardianto, Irawati, R., dan Lawita, N. F. (2025). Persepsi Pengguna terhadap Perangkat Lunak Akuntansi Usaha Kecil Berbasis Cloud. Jurnal Akuntansi dan Ekonomika, 15(1), 178-187. https://doi.org/10.37859/jae.v15i1.8505</w:t>
+      </w:r>
+    </w:p>
+    <w:p>
+      <w:pPr>
+        <w:spacing w:line="240" w:lineRule="auto" w:after="80" w:before="0"/>
+        <w:ind w:left="567" w:hanging="567"/>
+        <w:jc w:val="both"/>
+      </w:pPr>
+      <w:r>
+        <w:rPr>
+          <w:rFonts w:ascii="Times New Roman" w:hAnsi="Times New Roman" w:eastAsia="Times New Roman"/>
+          <w:b w:val="0"/>
+          <w:i w:val="0"/>
+          <w:sz w:val="20"/>
+        </w:rPr>
+        <w:t>Otoritas Jasa Keuangan dan Badan Pusat Statistik. (2025). Siaran Pers Bersama: Indeks Literasi dan Inklusi Keuangan Masyarakat Meningkat, Hasil Survei Nasional Literasi dan Inklusi Keuangan (SNLIK) Tahun 2025. Nomor SP 69/OJK/GKPB/V/2025, 2 Mei 2025. Diakses dari https://ojk.go.id/id/berita-dan-kegiatan/siaran-pers/Pages/OJK-dan-BPS-Umumkan-Hasil-Survei-Nasional-Literasi-Dan-Inklusi-Keuangan-SNLIK-Tahun-2025.aspx</w:t>
       </w:r>
     </w:p>
     <w:sectPr>

</xml_diff>